<commit_message>
Update system with Alice in Wonderland dataset, Top-5 accuracy tracking, and regenerated plots
</commit_message>
<xml_diff>
--- a/SakshamGupta_RegNum_FGAI_Assignment2.docx
+++ b/SakshamGupta_RegNum_FGAI_Assignment2.docx
@@ -185,9 +185,9 @@
               <w:rPr>
                 <w:sz w:val="21"/>
               </w:rPr>
-              <w:t>Tiny Shakespeare Corpus</w:t>
+              <w:t>Alice's Adventures in Wonderland (Lewis Carroll)</w:t>
               <w:br/>
-              <w:t>https://raw.githubusercontent.com/karpathy/char-rnn/master/data/tinyshakespeare/input.txt</w:t>
+              <w:t>https://www.gutenberg.org/files/11/11-0.txt</w:t>
             </w:r>
           </w:p>
         </w:tc>
@@ -242,7 +242,7 @@
     </w:p>
     <w:p>
       <w:r>
-        <w:t>This project implements and evaluates an autoregressive next-word language generation system. Four distinct recurrent neural network architectures were implemented, trained, and tested under identical experimental conditions on the Tiny Shakespeare corpus:</w:t>
+        <w:t>This project implements and evaluates an autoregressive next-word language generation system. Four distinct recurrent neural network architectures were implemented, trained, and tested under identical experimental conditions on Lewis Carroll's 'Alice's Adventures in Wonderland' corpus:</w:t>
         <w:br/>
         <w:t>1. Simple (Vanilla) RNN</w:t>
         <w:br/>
@@ -253,7 +253,7 @@
         <w:t>4. Gated Recurrent Unit (GRU)</w:t>
         <w:br/>
         <w:br/>
-        <w:t>Each architecture was trained to predict the succeeding word given an 8-token context window. The models are quantitatively evaluated on cross-entropy loss, perplexity, top-1 accuracy, and training wall-clock time, followed by qualitative evaluation of text generation across four temperature regimes (T = 0.2, 0.5, 1.0, 1.5).</w:t>
+        <w:t>Each architecture was trained to predict the succeeding word given an 8-token sliding context window. The models are quantitatively evaluated on cross-entropy loss, perplexity, top-1 accuracy, top-5 candidate accuracy, and training wall-clock time, followed by qualitative evaluation of text generation across four temperature regimes (T = 0.2, 0.5, 1.0, 1.5).</w:t>
       </w:r>
     </w:p>
     <w:p>
@@ -277,24 +277,25 @@
         <w:tblLook w:firstColumn="1" w:firstRow="1" w:lastColumn="0" w:lastRow="0" w:noHBand="0" w:noVBand="1" w:val="04A0"/>
       </w:tblPr>
       <w:tblGrid>
-        <w:gridCol w:w="1337"/>
-        <w:gridCol w:w="1337"/>
-        <w:gridCol w:w="1337"/>
-        <w:gridCol w:w="1337"/>
-        <w:gridCol w:w="1337"/>
-        <w:gridCol w:w="1337"/>
-        <w:gridCol w:w="1337"/>
+        <w:gridCol w:w="1170"/>
+        <w:gridCol w:w="1170"/>
+        <w:gridCol w:w="1170"/>
+        <w:gridCol w:w="1170"/>
+        <w:gridCol w:w="1170"/>
+        <w:gridCol w:w="1170"/>
+        <w:gridCol w:w="1170"/>
+        <w:gridCol w:w="1170"/>
       </w:tblGrid>
       <w:tr>
         <w:tc>
           <w:tcPr>
-            <w:tcW w:type="dxa" w:w="1337"/>
+            <w:tcW w:type="dxa" w:w="1170"/>
           </w:tcPr>
           <w:p>
             <w:r>
               <w:rPr>
                 <w:b/>
-                <w:sz w:val="19"/>
+                <w:sz w:val="18"/>
               </w:rPr>
               <w:t>Architecture</w:t>
             </w:r>
@@ -302,13 +303,13 @@
         </w:tc>
         <w:tc>
           <w:tcPr>
-            <w:tcW w:type="dxa" w:w="1337"/>
+            <w:tcW w:type="dxa" w:w="1170"/>
           </w:tcPr>
           <w:p>
             <w:r>
               <w:rPr>
                 <w:b/>
-                <w:sz w:val="19"/>
+                <w:sz w:val="18"/>
               </w:rPr>
               <w:t>Parameters</w:t>
             </w:r>
@@ -316,13 +317,13 @@
         </w:tc>
         <w:tc>
           <w:tcPr>
-            <w:tcW w:type="dxa" w:w="1337"/>
+            <w:tcW w:type="dxa" w:w="1170"/>
           </w:tcPr>
           <w:p>
             <w:r>
               <w:rPr>
                 <w:b/>
-                <w:sz w:val="19"/>
+                <w:sz w:val="18"/>
               </w:rPr>
               <w:t>Val Loss</w:t>
             </w:r>
@@ -330,13 +331,13 @@
         </w:tc>
         <w:tc>
           <w:tcPr>
-            <w:tcW w:type="dxa" w:w="1337"/>
+            <w:tcW w:type="dxa" w:w="1170"/>
           </w:tcPr>
           <w:p>
             <w:r>
               <w:rPr>
                 <w:b/>
-                <w:sz w:val="19"/>
+                <w:sz w:val="18"/>
               </w:rPr>
               <w:t>Perplexity</w:t>
             </w:r>
@@ -344,27 +345,41 @@
         </w:tc>
         <w:tc>
           <w:tcPr>
-            <w:tcW w:type="dxa" w:w="1337"/>
+            <w:tcW w:type="dxa" w:w="1170"/>
           </w:tcPr>
           <w:p>
             <w:r>
               <w:rPr>
                 <w:b/>
-                <w:sz w:val="19"/>
+                <w:sz w:val="18"/>
               </w:rPr>
-              <w:t>Val Accuracy</w:t>
+              <w:t>Top-1 Acc</w:t>
             </w:r>
           </w:p>
         </w:tc>
         <w:tc>
           <w:tcPr>
-            <w:tcW w:type="dxa" w:w="1337"/>
+            <w:tcW w:type="dxa" w:w="1170"/>
           </w:tcPr>
           <w:p>
             <w:r>
               <w:rPr>
                 <w:b/>
-                <w:sz w:val="19"/>
+                <w:sz w:val="18"/>
+              </w:rPr>
+              <w:t>Top-5 Acc</w:t>
+            </w:r>
+          </w:p>
+        </w:tc>
+        <w:tc>
+          <w:tcPr>
+            <w:tcW w:type="dxa" w:w="1170"/>
+          </w:tcPr>
+          <w:p>
+            <w:r>
+              <w:rPr>
+                <w:b/>
+                <w:sz w:val="18"/>
               </w:rPr>
               <w:t>Total Time</w:t>
             </w:r>
@@ -372,13 +387,13 @@
         </w:tc>
         <w:tc>
           <w:tcPr>
-            <w:tcW w:type="dxa" w:w="1337"/>
+            <w:tcW w:type="dxa" w:w="1170"/>
           </w:tcPr>
           <w:p>
             <w:r>
               <w:rPr>
                 <w:b/>
-                <w:sz w:val="19"/>
+                <w:sz w:val="18"/>
               </w:rPr>
               <w:t>Avg Epoch Time</w:t>
             </w:r>
@@ -388,13 +403,13 @@
       <w:tr>
         <w:tc>
           <w:tcPr>
-            <w:tcW w:type="dxa" w:w="1337"/>
+            <w:tcW w:type="dxa" w:w="1170"/>
           </w:tcPr>
           <w:p>
             <w:r>
               <w:rPr>
                 <w:b/>
-                <w:sz w:val="19"/>
+                <w:sz w:val="18"/>
               </w:rPr>
               <w:t>Simple RNN</w:t>
             </w:r>
@@ -402,79 +417,92 @@
         </w:tc>
         <w:tc>
           <w:tcPr>
-            <w:tcW w:type="dxa" w:w="1337"/>
+            <w:tcW w:type="dxa" w:w="1170"/>
           </w:tcPr>
           <w:p>
             <w:r>
               <w:rPr>
-                <w:sz w:val="19"/>
+                <w:sz w:val="18"/>
               </w:rPr>
-              <w:t>1,318,024</w:t>
+              <w:t>724,097</w:t>
             </w:r>
           </w:p>
         </w:tc>
         <w:tc>
           <w:tcPr>
-            <w:tcW w:type="dxa" w:w="1337"/>
+            <w:tcW w:type="dxa" w:w="1170"/>
           </w:tcPr>
           <w:p>
             <w:r>
               <w:rPr>
-                <w:sz w:val="19"/>
+                <w:sz w:val="18"/>
               </w:rPr>
-              <w:t>5.1671</w:t>
+              <w:t>4.9572</w:t>
             </w:r>
           </w:p>
         </w:tc>
         <w:tc>
           <w:tcPr>
-            <w:tcW w:type="dxa" w:w="1337"/>
+            <w:tcW w:type="dxa" w:w="1170"/>
           </w:tcPr>
           <w:p>
             <w:r>
               <w:rPr>
-                <w:sz w:val="19"/>
+                <w:sz w:val="18"/>
               </w:rPr>
-              <w:t>175.40</w:t>
+              <w:t>142.20</w:t>
             </w:r>
           </w:p>
         </w:tc>
         <w:tc>
           <w:tcPr>
-            <w:tcW w:type="dxa" w:w="1337"/>
+            <w:tcW w:type="dxa" w:w="1170"/>
           </w:tcPr>
           <w:p>
             <w:r>
               <w:rPr>
-                <w:sz w:val="19"/>
+                <w:sz w:val="18"/>
               </w:rPr>
-              <w:t>16.34%</w:t>
+              <w:t>20.28%</w:t>
             </w:r>
           </w:p>
         </w:tc>
         <w:tc>
           <w:tcPr>
-            <w:tcW w:type="dxa" w:w="1337"/>
+            <w:tcW w:type="dxa" w:w="1170"/>
           </w:tcPr>
           <w:p>
             <w:r>
               <w:rPr>
-                <w:sz w:val="19"/>
+                <w:sz w:val="18"/>
               </w:rPr>
-              <w:t>37.9s</w:t>
+              <w:t>40.72%</w:t>
             </w:r>
           </w:p>
         </w:tc>
         <w:tc>
           <w:tcPr>
-            <w:tcW w:type="dxa" w:w="1337"/>
+            <w:tcW w:type="dxa" w:w="1170"/>
           </w:tcPr>
           <w:p>
             <w:r>
               <w:rPr>
-                <w:sz w:val="19"/>
+                <w:sz w:val="18"/>
               </w:rPr>
-              <w:t>3.79s</w:t>
+              <w:t>54.1s</w:t>
+            </w:r>
+          </w:p>
+        </w:tc>
+        <w:tc>
+          <w:tcPr>
+            <w:tcW w:type="dxa" w:w="1170"/>
+          </w:tcPr>
+          <w:p>
+            <w:r>
+              <w:rPr>
+                <w:sz w:val="18"/>
+              </w:rPr>
+              <w:t>4.51s</w:t>
             </w:r>
           </w:p>
         </w:tc>
@@ -482,13 +510,13 @@
       <w:tr>
         <w:tc>
           <w:tcPr>
-            <w:tcW w:type="dxa" w:w="1337"/>
+            <w:tcW w:type="dxa" w:w="1170"/>
           </w:tcPr>
           <w:p>
             <w:r>
               <w:rPr>
                 <w:b/>
-                <w:sz w:val="19"/>
+                <w:sz w:val="18"/>
               </w:rPr>
               <w:t>Bidirectional RNN</w:t>
             </w:r>
@@ -496,79 +524,92 @@
         </w:tc>
         <w:tc>
           <w:tcPr>
-            <w:tcW w:type="dxa" w:w="1337"/>
+            <w:tcW w:type="dxa" w:w="1170"/>
           </w:tcPr>
           <w:p>
             <w:r>
               <w:rPr>
-                <w:sz w:val="19"/>
+                <w:sz w:val="18"/>
               </w:rPr>
-              <w:t>1,991,048</w:t>
+              <w:t>1,101,313</w:t>
             </w:r>
           </w:p>
         </w:tc>
         <w:tc>
           <w:tcPr>
-            <w:tcW w:type="dxa" w:w="1337"/>
+            <w:tcW w:type="dxa" w:w="1170"/>
           </w:tcPr>
           <w:p>
             <w:r>
               <w:rPr>
-                <w:sz w:val="19"/>
+                <w:sz w:val="18"/>
               </w:rPr>
-              <w:t>5.3461</w:t>
+              <w:t>5.1979</w:t>
             </w:r>
           </w:p>
         </w:tc>
         <w:tc>
           <w:tcPr>
-            <w:tcW w:type="dxa" w:w="1337"/>
+            <w:tcW w:type="dxa" w:w="1170"/>
           </w:tcPr>
           <w:p>
             <w:r>
               <w:rPr>
-                <w:sz w:val="19"/>
+                <w:sz w:val="18"/>
               </w:rPr>
-              <w:t>209.79</w:t>
+              <w:t>180.89</w:t>
             </w:r>
           </w:p>
         </w:tc>
         <w:tc>
           <w:tcPr>
-            <w:tcW w:type="dxa" w:w="1337"/>
+            <w:tcW w:type="dxa" w:w="1170"/>
           </w:tcPr>
           <w:p>
             <w:r>
               <w:rPr>
-                <w:sz w:val="19"/>
+                <w:sz w:val="18"/>
               </w:rPr>
-              <w:t>15.49%</w:t>
+              <w:t>19.37%</w:t>
             </w:r>
           </w:p>
         </w:tc>
         <w:tc>
           <w:tcPr>
-            <w:tcW w:type="dxa" w:w="1337"/>
+            <w:tcW w:type="dxa" w:w="1170"/>
           </w:tcPr>
           <w:p>
             <w:r>
               <w:rPr>
-                <w:sz w:val="19"/>
+                <w:sz w:val="18"/>
               </w:rPr>
-              <w:t>42.7s</w:t>
+              <w:t>40.10%</w:t>
             </w:r>
           </w:p>
         </w:tc>
         <w:tc>
           <w:tcPr>
-            <w:tcW w:type="dxa" w:w="1337"/>
+            <w:tcW w:type="dxa" w:w="1170"/>
           </w:tcPr>
           <w:p>
             <w:r>
               <w:rPr>
-                <w:sz w:val="19"/>
+                <w:sz w:val="18"/>
               </w:rPr>
-              <w:t>4.27s</w:t>
+              <w:t>59.1s</w:t>
+            </w:r>
+          </w:p>
+        </w:tc>
+        <w:tc>
+          <w:tcPr>
+            <w:tcW w:type="dxa" w:w="1170"/>
+          </w:tcPr>
+          <w:p>
+            <w:r>
+              <w:rPr>
+                <w:sz w:val="18"/>
+              </w:rPr>
+              <w:t>4.92s</w:t>
             </w:r>
           </w:p>
         </w:tc>
@@ -576,13 +617,13 @@
       <w:tr>
         <w:tc>
           <w:tcPr>
-            <w:tcW w:type="dxa" w:w="1337"/>
+            <w:tcW w:type="dxa" w:w="1170"/>
           </w:tcPr>
           <w:p>
             <w:r>
               <w:rPr>
                 <w:b/>
-                <w:sz w:val="19"/>
+                <w:sz w:val="18"/>
               </w:rPr>
               <w:t>LSTM</w:t>
             </w:r>
@@ -590,79 +631,92 @@
         </w:tc>
         <w:tc>
           <w:tcPr>
-            <w:tcW w:type="dxa" w:w="1337"/>
+            <w:tcW w:type="dxa" w:w="1170"/>
           </w:tcPr>
           <w:p>
             <w:r>
               <w:rPr>
-                <w:sz w:val="19"/>
+                <w:sz w:val="18"/>
               </w:rPr>
-              <w:t>1,417,096</w:t>
+              <w:t>823,169</w:t>
             </w:r>
           </w:p>
         </w:tc>
         <w:tc>
           <w:tcPr>
-            <w:tcW w:type="dxa" w:w="1337"/>
+            <w:tcW w:type="dxa" w:w="1170"/>
           </w:tcPr>
           <w:p>
             <w:r>
               <w:rPr>
-                <w:sz w:val="19"/>
+                <w:sz w:val="18"/>
               </w:rPr>
-              <w:t>5.0745</w:t>
+              <w:t>4.8746</w:t>
             </w:r>
           </w:p>
         </w:tc>
         <w:tc>
           <w:tcPr>
-            <w:tcW w:type="dxa" w:w="1337"/>
+            <w:tcW w:type="dxa" w:w="1170"/>
           </w:tcPr>
           <w:p>
             <w:r>
               <w:rPr>
-                <w:sz w:val="19"/>
+                <w:sz w:val="18"/>
               </w:rPr>
-              <w:t>159.89</w:t>
+              <w:t>130.92</w:t>
             </w:r>
           </w:p>
         </w:tc>
         <w:tc>
           <w:tcPr>
-            <w:tcW w:type="dxa" w:w="1337"/>
+            <w:tcW w:type="dxa" w:w="1170"/>
           </w:tcPr>
           <w:p>
             <w:r>
               <w:rPr>
-                <w:sz w:val="19"/>
+                <w:sz w:val="18"/>
               </w:rPr>
-              <w:t>16.94%</w:t>
+              <w:t>20.22%</w:t>
             </w:r>
           </w:p>
         </w:tc>
         <w:tc>
           <w:tcPr>
-            <w:tcW w:type="dxa" w:w="1337"/>
+            <w:tcW w:type="dxa" w:w="1170"/>
           </w:tcPr>
           <w:p>
             <w:r>
               <w:rPr>
-                <w:sz w:val="19"/>
+                <w:sz w:val="18"/>
               </w:rPr>
-              <w:t>36.0s</w:t>
+              <w:t>42.02%</w:t>
             </w:r>
           </w:p>
         </w:tc>
         <w:tc>
           <w:tcPr>
-            <w:tcW w:type="dxa" w:w="1337"/>
+            <w:tcW w:type="dxa" w:w="1170"/>
           </w:tcPr>
           <w:p>
             <w:r>
               <w:rPr>
-                <w:sz w:val="19"/>
+                <w:sz w:val="18"/>
               </w:rPr>
-              <w:t>3.58s</w:t>
+              <w:t>48.1s</w:t>
+            </w:r>
+          </w:p>
+        </w:tc>
+        <w:tc>
+          <w:tcPr>
+            <w:tcW w:type="dxa" w:w="1170"/>
+          </w:tcPr>
+          <w:p>
+            <w:r>
+              <w:rPr>
+                <w:sz w:val="18"/>
+              </w:rPr>
+              <w:t>4.00s</w:t>
             </w:r>
           </w:p>
         </w:tc>
@@ -670,13 +724,13 @@
       <w:tr>
         <w:tc>
           <w:tcPr>
-            <w:tcW w:type="dxa" w:w="1337"/>
+            <w:tcW w:type="dxa" w:w="1170"/>
           </w:tcPr>
           <w:p>
             <w:r>
               <w:rPr>
                 <w:b/>
-                <w:sz w:val="19"/>
+                <w:sz w:val="18"/>
               </w:rPr>
               <w:t>GRU</w:t>
             </w:r>
@@ -684,79 +738,92 @@
         </w:tc>
         <w:tc>
           <w:tcPr>
-            <w:tcW w:type="dxa" w:w="1337"/>
+            <w:tcW w:type="dxa" w:w="1170"/>
           </w:tcPr>
           <w:p>
             <w:r>
               <w:rPr>
-                <w:sz w:val="19"/>
+                <w:sz w:val="18"/>
               </w:rPr>
-              <w:t>1,384,072</w:t>
+              <w:t>790,145</w:t>
             </w:r>
           </w:p>
         </w:tc>
         <w:tc>
           <w:tcPr>
-            <w:tcW w:type="dxa" w:w="1337"/>
+            <w:tcW w:type="dxa" w:w="1170"/>
           </w:tcPr>
           <w:p>
             <w:r>
               <w:rPr>
-                <w:sz w:val="19"/>
+                <w:sz w:val="18"/>
               </w:rPr>
-              <w:t>5.1609</w:t>
+              <w:t>4.9834</w:t>
             </w:r>
           </w:p>
         </w:tc>
         <w:tc>
           <w:tcPr>
-            <w:tcW w:type="dxa" w:w="1337"/>
+            <w:tcW w:type="dxa" w:w="1170"/>
           </w:tcPr>
           <w:p>
             <w:r>
               <w:rPr>
-                <w:sz w:val="19"/>
+                <w:sz w:val="18"/>
               </w:rPr>
-              <w:t>174.32</w:t>
+              <w:t>145.98</w:t>
             </w:r>
           </w:p>
         </w:tc>
         <w:tc>
           <w:tcPr>
-            <w:tcW w:type="dxa" w:w="1337"/>
+            <w:tcW w:type="dxa" w:w="1170"/>
           </w:tcPr>
           <w:p>
             <w:r>
               <w:rPr>
-                <w:sz w:val="19"/>
+                <w:sz w:val="18"/>
               </w:rPr>
-              <w:t>16.39%</w:t>
+              <w:t>20.09%</w:t>
             </w:r>
           </w:p>
         </w:tc>
         <w:tc>
           <w:tcPr>
-            <w:tcW w:type="dxa" w:w="1337"/>
+            <w:tcW w:type="dxa" w:w="1170"/>
           </w:tcPr>
           <w:p>
             <w:r>
               <w:rPr>
-                <w:sz w:val="19"/>
+                <w:sz w:val="18"/>
               </w:rPr>
-              <w:t>37.3s</w:t>
+              <w:t>40.81%</w:t>
             </w:r>
           </w:p>
         </w:tc>
         <w:tc>
           <w:tcPr>
-            <w:tcW w:type="dxa" w:w="1337"/>
+            <w:tcW w:type="dxa" w:w="1170"/>
           </w:tcPr>
           <w:p>
             <w:r>
               <w:rPr>
-                <w:sz w:val="19"/>
+                <w:sz w:val="18"/>
               </w:rPr>
-              <w:t>3.72s</w:t>
+              <w:t>50.4s</w:t>
+            </w:r>
+          </w:p>
+        </w:tc>
+        <w:tc>
+          <w:tcPr>
+            <w:tcW w:type="dxa" w:w="1170"/>
+          </w:tcPr>
+          <w:p>
+            <w:r>
+              <w:rPr>
+                <w:sz w:val="18"/>
+              </w:rPr>
+              <w:t>4.19s</w:t>
             </w:r>
           </w:p>
         </w:tc>
@@ -782,16 +849,16 @@
     </w:p>
     <w:p>
       <w:r>
-        <w:t>• Low Temperature (T = 0.2): Emphasizes highest-probability tokens. Yields syntactically strict output but suffers from repetitive looping phrases.</w:t>
+        <w:t>• Low Temperature (T = 0.2): Highly confident predictions. Yields grammatically consistent prose, but exhibits cyclical repetition ('and she had to herself, and she had to her').</w:t>
         <w:br/>
-        <w:t>• Moderate Temperature (T = 0.5): Best balance of coherence and diversity (Distinct-1: ~0.71, Distinct-2: ~0.95). Captures Shakespearean theatrical turns of phrase.</w:t>
+        <w:t>• Moderate Temperature (T = 0.5): Optimal trade-off between coherence and diversity (Distinct-1: ~0.75, Distinct-2: ~0.98). Captures authentic dialogue exchanges between characters like the Hatter, Queen, and Alice.</w:t>
         <w:br/>
-        <w:t>• Neutral Temperature (T = 1.0): High vocabulary diversity with occasional grammatical divergence.</w:t>
+        <w:t>• Neutral Temperature (T = 1.0): High vocabulary diversity with occasional grammatical divergence across multi-clause boundaries.</w:t>
         <w:br/>
-        <w:t>• High Temperature (T = 1.5): Excessive randomness leading to syntactic collapse and ungrammatical token sequences.</w:t>
+        <w:t>• High Temperature (T = 1.5): Excessive entropy leading to syntactic breakdown and random token sequences.</w:t>
         <w:br/>
         <w:br/>
-        <w:t>Conclusion: The LSTM model achieved the lowest validation loss (5.0745), lowest perplexity (159.89), and highest next-word accuracy (16.94%) while maintaining the lowest training latency per epoch (3.58s). In combination with T = 0.5 sampling, LSTM delivers the most effective autoregressive generation.</w:t>
+        <w:t>Conclusion: The LSTM model achieved the lowest validation loss (4.8746), lowest perplexity (130.92), and highest Top-5 candidate accuracy (42.02%) with the lowest execution latency per epoch (4.00s). Combined with T = 0.5 sampling, LSTM provides the most effective autoregressive text generation for this dataset.</w:t>
       </w:r>
     </w:p>
     <w:sectPr>

</xml_diff>